<commit_message>
#260518 fix: fixed global settings
</commit_message>
<xml_diff>
--- a/files/gecikme-ihtari-kep.docx
+++ b/files/gecikme-ihtari-kep.docx
@@ -33,25 +33,7 @@
           <w:sz w:val="24"/>
           <w:szCs w:val="24"/>
         </w:rPr>
-        <w:t xml:space="preserve"> {{isim}} ({{</w:t>
-      </w:r>
-      <w:proofErr w:type="spellStart"/>
-      <w:r>
-        <w:rPr>
-          <w:rFonts w:ascii="Times New Roman" w:hAnsi="Times New Roman" w:cs="Times New Roman"/>
-          <w:sz w:val="24"/>
-          <w:szCs w:val="24"/>
-        </w:rPr>
-        <w:t>tc_vkn_no</w:t>
-      </w:r>
-      <w:proofErr w:type="spellEnd"/>
-      <w:r>
-        <w:rPr>
-          <w:rFonts w:ascii="Times New Roman" w:hAnsi="Times New Roman" w:cs="Times New Roman"/>
-          <w:sz w:val="24"/>
-          <w:szCs w:val="24"/>
-        </w:rPr>
-        <w:t>}})</w:t>
+        <w:t xml:space="preserve"> {{isim}} ({{tc_vkn_no}})</w:t>
       </w:r>
     </w:p>
     <w:p>
@@ -126,16 +108,7 @@
           <w:sz w:val="24"/>
           <w:szCs w:val="24"/>
         </w:rPr>
-        <w:t xml:space="preserve"> tarihi ve numarası yazılı finansal kiralama sözleşmesi imzalanmıştır. Bu sözleşmeye göre ödenmesi gereken </w:t>
-      </w:r>
-      <w:proofErr w:type="gramStart"/>
-      <w:r>
-        <w:rPr>
-          <w:rFonts w:ascii="Times New Roman" w:hAnsi="Times New Roman" w:cs="Times New Roman"/>
-          <w:sz w:val="24"/>
-          <w:szCs w:val="24"/>
-        </w:rPr>
-        <w:t>taksitlerinizden</w:t>
+        <w:t xml:space="preserve"> tarihi ve numarası yazılı finansal kiralama sözleşmesi imzalanmıştır. Bu sözleşmeye göre ödenmesi gereken taksitlerinizden</w:t>
       </w:r>
       <w:r>
         <w:rPr>
@@ -151,16 +124,7 @@
           <w:sz w:val="24"/>
           <w:szCs w:val="24"/>
         </w:rPr>
-        <w:t xml:space="preserve">  aşağıda</w:t>
-      </w:r>
-      <w:proofErr w:type="gramEnd"/>
-      <w:r>
-        <w:rPr>
-          <w:rFonts w:ascii="Times New Roman" w:hAnsi="Times New Roman" w:cs="Times New Roman"/>
-          <w:sz w:val="24"/>
-          <w:szCs w:val="24"/>
-        </w:rPr>
-        <w:t xml:space="preserve"> vadesi ve tutarı yazılı olan taksitiniz /taksitleriniz</w:t>
+        <w:t xml:space="preserve">  aşağıda vadesi ve tutarı yazılı olan taksitiniz /taksitleriniz</w:t>
       </w:r>
       <w:r>
         <w:rPr>
@@ -842,9 +806,24 @@
           <w:sz w:val="24"/>
           <w:szCs w:val="24"/>
         </w:rPr>
-        <w:t>{{</w:t>
-      </w:r>
-      <w:proofErr w:type="spellStart"/>
+        <w:t>{{sozlesme_tarih}}</w:t>
+      </w:r>
+      <w:r>
+        <w:rPr>
+          <w:rFonts w:ascii="Times New Roman" w:hAnsi="Times New Roman" w:cs="Times New Roman"/>
+          <w:sz w:val="24"/>
+          <w:szCs w:val="24"/>
+        </w:rPr>
+        <w:t xml:space="preserve"> </w:t>
+      </w:r>
+      <w:r>
+        <w:rPr>
+          <w:rFonts w:ascii="Times New Roman" w:hAnsi="Times New Roman" w:cs="Times New Roman"/>
+          <w:sz w:val="24"/>
+          <w:szCs w:val="24"/>
+        </w:rPr>
+        <w:t xml:space="preserve">tarih ve </w:t>
+      </w:r>
       <w:r>
         <w:rPr>
           <w:rFonts w:ascii="Times New Roman" w:hAnsi="Times New Roman" w:cs="Times New Roman"/>
@@ -853,18 +832,7 @@
           <w:sz w:val="24"/>
           <w:szCs w:val="24"/>
         </w:rPr>
-        <w:t>sozlesme_tarih</w:t>
-      </w:r>
-      <w:proofErr w:type="spellEnd"/>
-      <w:r>
-        <w:rPr>
-          <w:rFonts w:ascii="Times New Roman" w:hAnsi="Times New Roman" w:cs="Times New Roman"/>
-          <w:b/>
-          <w:bCs/>
-          <w:sz w:val="24"/>
-          <w:szCs w:val="24"/>
-        </w:rPr>
-        <w:t>}}</w:t>
+        <w:t>{{sozlesme_no}}</w:t>
       </w:r>
       <w:r>
         <w:rPr>
@@ -880,65 +848,7 @@
           <w:sz w:val="24"/>
           <w:szCs w:val="24"/>
         </w:rPr>
-        <w:t xml:space="preserve">tarih ve </w:t>
-      </w:r>
-      <w:r>
-        <w:rPr>
-          <w:rFonts w:ascii="Times New Roman" w:hAnsi="Times New Roman" w:cs="Times New Roman"/>
-          <w:b/>
-          <w:bCs/>
-          <w:sz w:val="24"/>
-          <w:szCs w:val="24"/>
-        </w:rPr>
-        <w:t>{{</w:t>
-      </w:r>
-      <w:proofErr w:type="spellStart"/>
-      <w:r>
-        <w:rPr>
-          <w:rFonts w:ascii="Times New Roman" w:hAnsi="Times New Roman" w:cs="Times New Roman"/>
-          <w:b/>
-          <w:bCs/>
-          <w:sz w:val="24"/>
-          <w:szCs w:val="24"/>
-        </w:rPr>
-        <w:t>sozlesme_no</w:t>
-      </w:r>
-      <w:proofErr w:type="spellEnd"/>
-      <w:r>
-        <w:rPr>
-          <w:rFonts w:ascii="Times New Roman" w:hAnsi="Times New Roman" w:cs="Times New Roman"/>
-          <w:b/>
-          <w:bCs/>
-          <w:sz w:val="24"/>
-          <w:szCs w:val="24"/>
-        </w:rPr>
-        <w:t>}}</w:t>
-      </w:r>
-      <w:r>
-        <w:rPr>
-          <w:rFonts w:ascii="Times New Roman" w:hAnsi="Times New Roman" w:cs="Times New Roman"/>
-          <w:sz w:val="24"/>
-          <w:szCs w:val="24"/>
-        </w:rPr>
-        <w:t xml:space="preserve"> </w:t>
-      </w:r>
-      <w:proofErr w:type="spellStart"/>
-      <w:r>
-        <w:rPr>
-          <w:rFonts w:ascii="Times New Roman" w:hAnsi="Times New Roman" w:cs="Times New Roman"/>
-          <w:sz w:val="24"/>
-          <w:szCs w:val="24"/>
-        </w:rPr>
-        <w:t>nolu</w:t>
-      </w:r>
-      <w:proofErr w:type="spellEnd"/>
-      <w:r>
-        <w:rPr>
-          <w:rFonts w:ascii="Times New Roman" w:hAnsi="Times New Roman" w:cs="Times New Roman"/>
-          <w:sz w:val="24"/>
-          <w:szCs w:val="24"/>
-        </w:rPr>
-        <w:t xml:space="preserve"> finansal kiralama sözleşmemiz</w:t>
+        <w:t>nolu finansal kiralama sözleşmemiz</w:t>
       </w:r>
     </w:p>
     <w:p>
@@ -970,35 +880,15 @@
           <w:sz w:val="24"/>
           <w:szCs w:val="24"/>
         </w:rPr>
-        <w:t>{{</w:t>
-      </w:r>
-      <w:proofErr w:type="spellStart"/>
-      <w:r>
-        <w:rPr>
-          <w:rFonts w:ascii="Times New Roman" w:hAnsi="Times New Roman" w:cs="Times New Roman"/>
-          <w:bCs/>
-          <w:sz w:val="24"/>
-          <w:szCs w:val="24"/>
-        </w:rPr>
-        <w:t>gecikme_bakiye</w:t>
-      </w:r>
-      <w:proofErr w:type="spellEnd"/>
-      <w:r>
-        <w:rPr>
-          <w:rFonts w:ascii="Times New Roman" w:hAnsi="Times New Roman" w:cs="Times New Roman"/>
-          <w:bCs/>
-          <w:sz w:val="24"/>
-          <w:szCs w:val="24"/>
-        </w:rPr>
-        <w:t xml:space="preserve">}} </w:t>
-      </w:r>
-      <w:r>
-        <w:rPr>
-          <w:rFonts w:ascii="Times New Roman" w:hAnsi="Times New Roman" w:cs="Times New Roman"/>
-          <w:sz w:val="24"/>
-          <w:szCs w:val="24"/>
-        </w:rPr>
-        <w:t>TL</w:t>
+        <w:t xml:space="preserve">{{gecikme_bakiye}} </w:t>
+      </w:r>
+      <w:r>
+        <w:rPr>
+          <w:rFonts w:ascii="Times New Roman" w:hAnsi="Times New Roman" w:cs="Times New Roman"/>
+          <w:sz w:val="24"/>
+          <w:szCs w:val="24"/>
+        </w:rPr>
+        <w:t>{{pb}}</w:t>
       </w:r>
     </w:p>
     <w:p>
@@ -1038,35 +928,15 @@
           <w:sz w:val="24"/>
           <w:szCs w:val="24"/>
         </w:rPr>
-        <w:t>{{</w:t>
-      </w:r>
-      <w:proofErr w:type="spellStart"/>
-      <w:r>
-        <w:rPr>
-          <w:rFonts w:ascii="Times New Roman" w:hAnsi="Times New Roman" w:cs="Times New Roman"/>
-          <w:bCs/>
-          <w:sz w:val="24"/>
-          <w:szCs w:val="24"/>
-        </w:rPr>
-        <w:t>masraf_bakiye</w:t>
-      </w:r>
-      <w:proofErr w:type="spellEnd"/>
-      <w:r>
-        <w:rPr>
-          <w:rFonts w:ascii="Times New Roman" w:hAnsi="Times New Roman" w:cs="Times New Roman"/>
-          <w:bCs/>
-          <w:sz w:val="24"/>
-          <w:szCs w:val="24"/>
-        </w:rPr>
-        <w:t xml:space="preserve">}} </w:t>
-      </w:r>
-      <w:r>
-        <w:rPr>
-          <w:rFonts w:ascii="Times New Roman" w:hAnsi="Times New Roman" w:cs="Times New Roman"/>
-          <w:sz w:val="24"/>
-          <w:szCs w:val="24"/>
-        </w:rPr>
-        <w:t>TL</w:t>
+        <w:t xml:space="preserve">{{masraf_bakiye}} </w:t>
+      </w:r>
+      <w:r>
+        <w:rPr>
+          <w:rFonts w:ascii="Times New Roman" w:hAnsi="Times New Roman" w:cs="Times New Roman"/>
+          <w:sz w:val="24"/>
+          <w:szCs w:val="24"/>
+        </w:rPr>
+        <w:t>{{pb}}</w:t>
       </w:r>
     </w:p>
     <w:p>
@@ -1094,96 +964,15 @@
           <w:sz w:val="24"/>
           <w:szCs w:val="24"/>
         </w:rPr>
-        <w:t>{{</w:t>
-      </w:r>
-      <w:proofErr w:type="spellStart"/>
-      <w:r>
-        <w:rPr>
-          <w:rFonts w:ascii="Times New Roman" w:hAnsi="Times New Roman" w:cs="Times New Roman"/>
-          <w:bCs/>
-          <w:sz w:val="24"/>
-          <w:szCs w:val="24"/>
-        </w:rPr>
-        <w:t>toplam_borc_bakiye</w:t>
-      </w:r>
-      <w:proofErr w:type="spellEnd"/>
-      <w:r>
-        <w:rPr>
-          <w:rFonts w:ascii="Times New Roman" w:hAnsi="Times New Roman" w:cs="Times New Roman"/>
-          <w:bCs/>
-          <w:sz w:val="24"/>
-          <w:szCs w:val="24"/>
-        </w:rPr>
-        <w:t xml:space="preserve">}} </w:t>
-      </w:r>
-      <w:r>
-        <w:rPr>
-          <w:rFonts w:ascii="Times New Roman" w:hAnsi="Times New Roman" w:cs="Times New Roman"/>
-          <w:sz w:val="24"/>
-          <w:szCs w:val="24"/>
-        </w:rPr>
-        <w:t>TL</w:t>
-      </w:r>
-    </w:p>
-    <w:p>
-      <w:pPr>
-        <w:pStyle w:val="ListeParagraf"/>
-        <w:jc w:val="both"/>
-        <w:rPr>
-          <w:rFonts w:ascii="Times New Roman" w:hAnsi="Times New Roman" w:cs="Times New Roman"/>
-          <w:sz w:val="24"/>
-          <w:szCs w:val="24"/>
-        </w:rPr>
-      </w:pPr>
-      <w:r>
-        <w:rPr>
-          <w:rFonts w:ascii="Times New Roman" w:hAnsi="Times New Roman" w:cs="Times New Roman"/>
-          <w:sz w:val="24"/>
-          <w:szCs w:val="24"/>
-        </w:rPr>
-        <w:t xml:space="preserve">Tebliğ giderleri (Noter </w:t>
-      </w:r>
-      <w:proofErr w:type="gramStart"/>
-      <w:r>
-        <w:rPr>
-          <w:rFonts w:ascii="Times New Roman" w:hAnsi="Times New Roman" w:cs="Times New Roman"/>
-          <w:sz w:val="24"/>
-          <w:szCs w:val="24"/>
-        </w:rPr>
-        <w:t>gönderimlerinde)  3</w:t>
-      </w:r>
-      <w:r>
-        <w:rPr>
-          <w:rFonts w:ascii="Times New Roman" w:hAnsi="Times New Roman" w:cs="Times New Roman"/>
-          <w:sz w:val="24"/>
-          <w:szCs w:val="24"/>
-        </w:rPr>
-        <w:t>.</w:t>
-      </w:r>
-      <w:r>
-        <w:rPr>
-          <w:rFonts w:ascii="Times New Roman" w:hAnsi="Times New Roman" w:cs="Times New Roman"/>
-          <w:sz w:val="24"/>
-          <w:szCs w:val="24"/>
-        </w:rPr>
-        <w:t>200</w:t>
-      </w:r>
-      <w:proofErr w:type="gramEnd"/>
-      <w:r>
-        <w:rPr>
-          <w:rFonts w:ascii="Times New Roman" w:hAnsi="Times New Roman" w:cs="Times New Roman"/>
-          <w:sz w:val="24"/>
-          <w:szCs w:val="24"/>
-        </w:rPr>
-        <w:t>,</w:t>
-      </w:r>
-      <w:r>
-        <w:rPr>
-          <w:rFonts w:ascii="Times New Roman" w:hAnsi="Times New Roman" w:cs="Times New Roman"/>
-          <w:sz w:val="24"/>
-          <w:szCs w:val="24"/>
-        </w:rPr>
-        <w:t>00 TL</w:t>
+        <w:t xml:space="preserve">{{toplam_borc_bakiye}} </w:t>
+      </w:r>
+      <w:r>
+        <w:rPr>
+          <w:rFonts w:ascii="Times New Roman" w:hAnsi="Times New Roman" w:cs="Times New Roman"/>
+          <w:sz w:val="24"/>
+          <w:szCs w:val="24"/>
+        </w:rPr>
+        <w:t>{{pb}}</w:t>
       </w:r>
     </w:p>
     <w:p>
@@ -1283,25 +1072,7 @@
         <w:szCs w:val="24"/>
       </w:rPr>
       <w:tab/>
-      <w:t xml:space="preserve">İletişim: </w:t>
-    </w:r>
-    <w:proofErr w:type="gramStart"/>
-    <w:r>
-      <w:rPr>
-        <w:rFonts w:ascii="Calibri" w:hAnsi="Calibri" w:cs="Calibri"/>
-        <w:sz w:val="24"/>
-        <w:szCs w:val="24"/>
-      </w:rPr>
-      <w:t>444  76</w:t>
-    </w:r>
-    <w:proofErr w:type="gramEnd"/>
-    <w:r>
-      <w:rPr>
-        <w:rFonts w:ascii="Calibri" w:hAnsi="Calibri" w:cs="Calibri"/>
-        <w:sz w:val="24"/>
-        <w:szCs w:val="24"/>
-      </w:rPr>
-      <w:t xml:space="preserve"> 80</w:t>
+      <w:t>İletişim: 444  76 80</w:t>
     </w:r>
     <w:bookmarkEnd w:id="0"/>
     <w:r>

</xml_diff>